<commit_message>
Update memo docx templates with bilingual EN/ES content
- Both plain and fancy memo .docx now have dual-language sections
  (English first, dashed divider, then Spanish)
- FROM: ASPMG — On Behalf of the Board / En Nombre de la Junta Directiva
- Signature: On Behalf of the Board of Directors, [Association Name]
- Meta fields bilingual: DATE/FECHA, TO/PARA, FROM/DE, RE/ASUNTO
- Updated brand kit descriptions to reflect bilingual format
- Removed HTML memo templates (keeping docx workflow)

Co-Authored-By: Claude Opus 4.6 <noreply@anthropic.com>
</commit_message>
<xml_diff>
--- a/src/templates/ASPMG-Community-Memo - fancy.docx
+++ b/src/templates/ASPMG-Community-Memo - fancy.docx
@@ -235,7 +235,7 @@
           <w:color w:val="A89060"/>
           <w:sz w:val="16"/>
         </w:rPr>
-        <w:t xml:space="preserve">  MEMO COMUNITARIO  </w:t>
+        <w:t xml:space="preserve">  COMMUNITY MEMO / MEMO COMUNITARIO  </w:t>
       </w:r>
     </w:p>
     <w:p>
@@ -249,7 +249,7 @@
           <w:color w:val="1B2A4A"/>
           <w:sz w:val="36"/>
         </w:rPr>
-        <w:t>[Asunto / Título del Memo]</w:t>
+        <w:t>[Subject / Asunto]</w:t>
       </w:r>
     </w:p>
     <w:p>
@@ -263,7 +263,7 @@
           <w:color w:val="A89060"/>
           <w:sz w:val="20"/>
         </w:rPr>
-        <w:t>[Nombre de la Comunidad] Association</w:t>
+        <w:t>[Association Name]</w:t>
       </w:r>
     </w:p>
     <w:tbl>
@@ -290,7 +290,7 @@
                 <w:color w:val="A89060"/>
                 <w:sz w:val="16"/>
               </w:rPr>
-              <w:t>FECHA</w:t>
+              <w:t>DATE / FECHA</w:t>
             </w:r>
           </w:p>
         </w:tc>
@@ -322,7 +322,7 @@
                 <w:color w:val="A89060"/>
                 <w:sz w:val="16"/>
               </w:rPr>
-              <w:t>PARA</w:t>
+              <w:t>TO / PARA</w:t>
             </w:r>
           </w:p>
         </w:tc>
@@ -336,7 +336,7 @@
                 <w:color w:val="1B2A4A"/>
                 <w:sz w:val="21"/>
               </w:rPr>
-              <w:t>Todos los Residentes y Propietarios</w:t>
+              <w:t>All Residents &amp; Unit Owners / Todos los Residentes y Propietarios</w:t>
             </w:r>
           </w:p>
         </w:tc>
@@ -354,7 +354,7 @@
                 <w:color w:val="A89060"/>
                 <w:sz w:val="16"/>
               </w:rPr>
-              <w:t>DE</w:t>
+              <w:t>FROM / DE</w:t>
             </w:r>
           </w:p>
         </w:tc>
@@ -368,7 +368,7 @@
                 <w:color w:val="1B2A4A"/>
                 <w:sz w:val="21"/>
               </w:rPr>
-              <w:t>ASPMG — Administración de Propiedades</w:t>
+              <w:t>ASPMG — On Behalf of the Board / En Nombre de la Junta Directiva</w:t>
             </w:r>
           </w:p>
         </w:tc>
@@ -386,7 +386,7 @@
                 <w:color w:val="A89060"/>
                 <w:sz w:val="16"/>
               </w:rPr>
-              <w:t>PRIORIDAD</w:t>
+              <w:t>RE / ASUNTO</w:t>
             </w:r>
           </w:p>
         </w:tc>
@@ -400,7 +400,7 @@
                 <w:color w:val="1B2A4A"/>
                 <w:sz w:val="21"/>
               </w:rPr>
-              <w:t>[Normal / Importante / Urgente]</w:t>
+              <w:t>[Subject of Memo / Asunto del Memorando]</w:t>
             </w:r>
           </w:p>
         </w:tc>
@@ -422,7 +422,7 @@
           <w:color w:val="1A1E2C"/>
           <w:sz w:val="22"/>
         </w:rPr>
-        <w:t>Estimados Residentes,</w:t>
+        <w:t>Dear Residents,</w:t>
       </w:r>
     </w:p>
     <w:p>
@@ -436,7 +436,7 @@
           <w:color w:val="1A1E2C"/>
           <w:sz w:val="22"/>
         </w:rPr>
-        <w:t>Lorem ipsum dolor sit amet, consectetur adipiscing elit. Sed do eiusmod tempor incididunt ut labore et dolore magna aliqua. Ut enim ad minim veniam, quis nostrud exercitation ullamco laboris.</w:t>
+        <w:t>[Opening paragraph — state the purpose of the memo clearly. The Board of Directors would like to inform you of important updates regarding your community.]</w:t>
       </w:r>
     </w:p>
     <w:p>
@@ -450,7 +450,7 @@
           <w:color w:val="1B2A4A"/>
           <w:sz w:val="26"/>
         </w:rPr>
-        <w:t>Información Importante</w:t>
+        <w:t>Action Required</w:t>
       </w:r>
     </w:p>
     <w:p>
@@ -459,7 +459,7 @@
         <w:spacing w:after="60"/>
       </w:pPr>
       <w:r>
-        <w:t>Primer punto importante o actualización</w:t>
+        <w:t>[Action item or key takeaway]</w:t>
       </w:r>
     </w:p>
     <w:p>
@@ -468,7 +468,7 @@
         <w:spacing w:after="60"/>
       </w:pPr>
       <w:r>
-        <w:t>Segundo punto importante o actualización</w:t>
+        <w:t>[Action item or key takeaway]</w:t>
       </w:r>
     </w:p>
     <w:p>
@@ -477,7 +477,7 @@
         <w:spacing w:after="60"/>
       </w:pPr>
       <w:r>
-        <w:t>Tercer punto importante o actualización</w:t>
+        <w:t>[Action item or key takeaway]</w:t>
       </w:r>
     </w:p>
     <w:tbl>
@@ -507,7 +507,7 @@
                 <w:color w:val="1B2A4A"/>
                 <w:sz w:val="21"/>
               </w:rPr>
-              <w:t xml:space="preserve">Importante: </w:t>
+              <w:t>Important / Importante: [Key action or deadline residents need to know. / Acción clave o fecha límite que los residentes deben conocer.]</w:t>
             </w:r>
             <w:r>
               <w:rPr>
@@ -536,7 +536,7 @@
           <w:color w:val="1A1E2C"/>
           <w:sz w:val="22"/>
         </w:rPr>
-        <w:t>Si tiene alguna pregunta o inquietud, no dude en contactar nuestra oficina al (305) 661-8400 o envíenos un correo a info@aspmg.com.</w:t>
+        <w:t>— — — — — — — — — — — — — — — — — — — — — —</w:t>
       </w:r>
     </w:p>
     <w:p>
@@ -550,7 +550,19 @@
           <w:color w:val="1A1E2C"/>
           <w:sz w:val="22"/>
         </w:rPr>
-        <w:t>Gracias por su cooperación y por ser un miembro valioso de nuestra comunidad.</w:t>
+        <w:t>Estimados Residentes,</w:t>
+        <w:br/>
+        <w:br/>
+        <w:t>[Párrafo de apertura — indique el propósito del memorando de manera clara. La Junta Directiva desea informarles sobre actualizaciones importantes relacionadas con su comunidad.]</w:t>
+        <w:br/>
+        <w:br/>
+        <w:t>Acción Requerida</w:t>
+        <w:br/>
+        <w:t>• [Punto de acción o información clave]</w:t>
+        <w:br/>
+        <w:t>• [Punto de acción o información clave]</w:t>
+        <w:br/>
+        <w:t>• [Punto de acción o información clave]</w:t>
       </w:r>
     </w:p>
     <w:p>
@@ -564,7 +576,7 @@
           <w:color w:val="1B2A4A"/>
           <w:sz w:val="22"/>
         </w:rPr>
-        <w:t>Equipo de Administración ASPMG</w:t>
+        <w:t>[Manager Name] — ASPMG</w:t>
       </w:r>
     </w:p>
     <w:p>
@@ -578,7 +590,7 @@
           <w:color w:val="A89060"/>
           <w:sz w:val="20"/>
         </w:rPr>
-        <w:t>A Solid Property Management Group</w:t>
+        <w:t>On Behalf of the Board of Directors / En Nombre de la Junta Directiva, [Association Name]</w:t>
       </w:r>
     </w:p>
     <w:p/>

</xml_diff>